<commit_message>
docs(privacy+seo): analytics disclosure in privacy policy; search-console prep
- Privacy Policy (EN/ES): add a "website analytics" disclosure under section 3
  clarifying faroquant.com uses cookieless Cloudflare Web Analytics while the
  self-hosted App still has none; effective date bumped to 2026-07-13. Edited
  the .docx and regenerated the served .pdf.
- website/index.html: staged (commented) Google Search Console + Bing
  Webmaster verification meta slots with activation instructions.
- PROJECT-HANDOFF + CHANGELOG updated to current reality.

Co-Authored-By: Claude Opus 4.8 <noreply@anthropic.com>
</commit_message>
<xml_diff>
--- a/docs/legal/Faro-Privacy-Policy.docx
+++ b/docs/legal/Faro-Privacy-Policy.docx
@@ -29,7 +29,7 @@
           <w:sz w:val="22"/>
           <w:szCs w:val="22"/>
         </w:rPr>
-        <w:t xml:space="preserve">Effective date: July 7, 2026  ·  Fecha de vigencia: 7 de julio de 2026  ·  faroquant.com</w:t>
+        <w:t>Effective date: July 13, 2026  ·  Fecha de vigencia: 13 de julio de 2026  ·  faroquant.com</w:t>
       </w:r>
     </w:p>
     <w:p>
@@ -208,6 +208,19 @@
     </w:p>
     <w:p>
       <w:pPr>
+        <w:pStyle w:val="ListParagraph"/>
+        <w:numPr>
+          <w:ilvl w:val="0"/>
+          <w:numId w:val="2"/>
+        </w:numPr>
+        <w:spacing w:after="80"/>
+      </w:pPr>
+      <w:r>
+        <w:t>Website analytics (faroquant.com only): the public website uses Cloudflare Web Analytics, a privacy-friendly, cookieless service — it sets no cookies and collects no personal data or cross-site tracking identifiers. The self-hosted App itself contains no analytics or tracking.</w:t>
+      </w:r>
+    </w:p>
+    <w:p>
+      <w:pPr>
         <w:pStyle w:val="Heading2"/>
         <w:spacing w:after="120" w:before="240"/>
       </w:pPr>
@@ -539,6 +552,19 @@
           <w:szCs w:val="22"/>
         </w:rPr>
         <w:t xml:space="preserve">Chat de IA con Ollama (alternativa predeterminada): funciona completamente en tu propia máquina; ningún dato del chat sale de tu dispositivo.</w:t>
+      </w:r>
+    </w:p>
+    <w:p>
+      <w:pPr>
+        <w:pStyle w:val="ListParagraph"/>
+        <w:numPr>
+          <w:ilvl w:val="0"/>
+          <w:numId w:val="2"/>
+        </w:numPr>
+        <w:spacing w:after="80"/>
+      </w:pPr>
+      <w:r>
+        <w:t>Analítica del sitio web (solo faroquant.com): el sitio web público usa Cloudflare Web Analytics, un servicio que respeta la privacidad y no usa cookies — no establece cookies ni recopila datos personales ni identificadores de rastreo entre sitios. La Aplicación autoalojada no contiene analítica ni rastreo.</w:t>
       </w:r>
     </w:p>
     <w:p>

</xml_diff>